<commit_message>
Rebuild report to the original filename
</commit_message>
<xml_diff>
--- a/docs/report/CA3_Report_Geometric_Consistency.docx
+++ b/docs/report/CA3_Report_Geometric_Consistency.docx
@@ -2779,16 +2779,18 @@
         <w:tblLook w:firstColumn="1" w:firstRow="1" w:lastColumn="0" w:lastRow="0" w:noHBand="0" w:noVBand="1" w:val="04A0"/>
       </w:tblPr>
       <w:tblGrid>
-        <w:gridCol w:w="1872"/>
-        <w:gridCol w:w="1872"/>
-        <w:gridCol w:w="1872"/>
-        <w:gridCol w:w="1872"/>
-        <w:gridCol w:w="1872"/>
+        <w:gridCol w:w="1337"/>
+        <w:gridCol w:w="1337"/>
+        <w:gridCol w:w="1337"/>
+        <w:gridCol w:w="1337"/>
+        <w:gridCol w:w="1337"/>
+        <w:gridCol w:w="1337"/>
+        <w:gridCol w:w="1337"/>
       </w:tblGrid>
       <w:tr>
         <w:tc>
           <w:tcPr>
-            <w:tcW w:type="dxa" w:w="2592"/>
+            <w:tcW w:type="dxa" w:w="2232"/>
             <w:shd w:val="clear" w:fill="D9E2F3"/>
           </w:tcPr>
           <w:p>
@@ -2796,7 +2798,7 @@
             <w:r>
               <w:rPr>
                 <w:b/>
-                <w:sz w:val="19"/>
+                <w:sz w:val="17"/>
               </w:rPr>
               <w:t>Quantity</w:t>
             </w:r>
@@ -2804,7 +2806,7 @@
         </w:tc>
         <w:tc>
           <w:tcPr>
-            <w:tcW w:type="dxa" w:w="1872"/>
+            <w:tcW w:type="dxa" w:w="1296"/>
             <w:shd w:val="clear" w:fill="D9E2F3"/>
           </w:tcPr>
           <w:p>
@@ -2812,15 +2814,15 @@
             <w:r>
               <w:rPr>
                 <w:b/>
-                <w:sz w:val="19"/>
+                <w:sz w:val="17"/>
               </w:rPr>
-              <w:t>York Urban (curated real)</w:t>
+              <w:t>York Urban (real)</w:t>
             </w:r>
           </w:p>
         </w:tc>
         <w:tc>
           <w:tcPr>
-            <w:tcW w:type="dxa" w:w="1872"/>
+            <w:tcW w:type="dxa" w:w="1224"/>
             <w:shd w:val="clear" w:fill="D9E2F3"/>
           </w:tcPr>
           <w:p>
@@ -2828,15 +2830,15 @@
             <w:r>
               <w:rPr>
                 <w:b/>
-                <w:sz w:val="19"/>
+                <w:sz w:val="17"/>
               </w:rPr>
-              <w:t>Commons (uncurated real)</w:t>
+              <w:t>Commons (real)</w:t>
             </w:r>
           </w:p>
         </w:tc>
         <w:tc>
           <w:tcPr>
-            <w:tcW w:type="dxa" w:w="1584"/>
+            <w:tcW w:type="dxa" w:w="1008"/>
             <w:shd w:val="clear" w:fill="D9E2F3"/>
           </w:tcPr>
           <w:p>
@@ -2844,15 +2846,15 @@
             <w:r>
               <w:rPr>
                 <w:b/>
-                <w:sz w:val="19"/>
+                <w:sz w:val="17"/>
               </w:rPr>
-              <w:t>SD 1.5 (line-rich)</w:t>
+              <w:t>SD 1.5</w:t>
             </w:r>
           </w:p>
         </w:tc>
         <w:tc>
           <w:tcPr>
-            <w:tcW w:type="dxa" w:w="1440"/>
+            <w:tcW w:type="dxa" w:w="1008"/>
             <w:shd w:val="clear" w:fill="D9E2F3"/>
           </w:tcPr>
           <w:p>
@@ -2860,9 +2862,41 @@
             <w:r>
               <w:rPr>
                 <w:b/>
-                <w:sz w:val="19"/>
+                <w:sz w:val="17"/>
               </w:rPr>
-              <w:t>SDXL (line-rich)</w:t>
+              <w:t>SDXL</w:t>
+            </w:r>
+          </w:p>
+        </w:tc>
+        <w:tc>
+          <w:tcPr>
+            <w:tcW w:type="dxa" w:w="1296"/>
+            <w:shd w:val="clear" w:fill="D9E2F3"/>
+          </w:tcPr>
+          <w:p>
+            <w:r/>
+            <w:r>
+              <w:rPr>
+                <w:b/>
+                <w:sz w:val="17"/>
+              </w:rPr>
+              <w:t>Gemini</w:t>
+            </w:r>
+          </w:p>
+        </w:tc>
+        <w:tc>
+          <w:tcPr>
+            <w:tcW w:type="dxa" w:w="1296"/>
+            <w:shd w:val="clear" w:fill="D9E2F3"/>
+          </w:tcPr>
+          <w:p>
+            <w:r/>
+            <w:r>
+              <w:rPr>
+                <w:b/>
+                <w:sz w:val="17"/>
+              </w:rPr>
+              <w:t>GPT-image</w:t>
             </w:r>
           </w:p>
         </w:tc>
@@ -2870,13 +2904,13 @@
       <w:tr>
         <w:tc>
           <w:tcPr>
-            <w:tcW w:type="dxa" w:w="2592"/>
+            <w:tcW w:type="dxa" w:w="2232"/>
           </w:tcPr>
           <w:p>
             <w:r/>
             <w:r>
               <w:rPr>
-                <w:sz w:val="19"/>
+                <w:sz w:val="17"/>
               </w:rPr>
               <w:t>Images admitted by the rule</w:t>
             </w:r>
@@ -2884,13 +2918,13 @@
         </w:tc>
         <w:tc>
           <w:tcPr>
-            <w:tcW w:type="dxa" w:w="1872"/>
+            <w:tcW w:type="dxa" w:w="1296"/>
           </w:tcPr>
           <w:p>
             <w:r/>
             <w:r>
               <w:rPr>
-                <w:sz w:val="19"/>
+                <w:sz w:val="17"/>
               </w:rPr>
               <w:t>72</w:t>
             </w:r>
@@ -2898,13 +2932,13 @@
         </w:tc>
         <w:tc>
           <w:tcPr>
-            <w:tcW w:type="dxa" w:w="1872"/>
+            <w:tcW w:type="dxa" w:w="1224"/>
           </w:tcPr>
           <w:p>
             <w:r/>
             <w:r>
               <w:rPr>
-                <w:sz w:val="19"/>
+                <w:sz w:val="17"/>
               </w:rPr>
               <w:t>121</w:t>
             </w:r>
@@ -2912,13 +2946,13 @@
         </w:tc>
         <w:tc>
           <w:tcPr>
-            <w:tcW w:type="dxa" w:w="1584"/>
+            <w:tcW w:type="dxa" w:w="1008"/>
           </w:tcPr>
           <w:p>
             <w:r/>
             <w:r>
               <w:rPr>
-                <w:sz w:val="19"/>
+                <w:sz w:val="17"/>
               </w:rPr>
               <w:t>92</w:t>
             </w:r>
@@ -2926,15 +2960,43 @@
         </w:tc>
         <w:tc>
           <w:tcPr>
-            <w:tcW w:type="dxa" w:w="1440"/>
+            <w:tcW w:type="dxa" w:w="1008"/>
           </w:tcPr>
           <w:p>
             <w:r/>
             <w:r>
               <w:rPr>
-                <w:sz w:val="19"/>
+                <w:sz w:val="17"/>
               </w:rPr>
               <w:t>112</w:t>
+            </w:r>
+          </w:p>
+        </w:tc>
+        <w:tc>
+          <w:tcPr>
+            <w:tcW w:type="dxa" w:w="1296"/>
+          </w:tcPr>
+          <w:p>
+            <w:r/>
+            <w:r>
+              <w:rPr>
+                <w:sz w:val="17"/>
+              </w:rPr>
+              <w:t>—</w:t>
+            </w:r>
+          </w:p>
+        </w:tc>
+        <w:tc>
+          <w:tcPr>
+            <w:tcW w:type="dxa" w:w="1296"/>
+          </w:tcPr>
+          <w:p>
+            <w:r/>
+            <w:r>
+              <w:rPr>
+                <w:sz w:val="17"/>
+              </w:rPr>
+              <w:t>—</w:t>
             </w:r>
           </w:p>
         </w:tc>
@@ -2942,13 +3004,13 @@
       <w:tr>
         <w:tc>
           <w:tcPr>
-            <w:tcW w:type="dxa" w:w="2592"/>
+            <w:tcW w:type="dxa" w:w="2232"/>
           </w:tcPr>
           <w:p>
             <w:r/>
             <w:r>
               <w:rPr>
-                <w:sz w:val="19"/>
+                <w:sz w:val="17"/>
               </w:rPr>
               <w:t>With at least two horizontal families</w:t>
             </w:r>
@@ -2956,13 +3018,13 @@
         </w:tc>
         <w:tc>
           <w:tcPr>
-            <w:tcW w:type="dxa" w:w="1872"/>
+            <w:tcW w:type="dxa" w:w="1296"/>
           </w:tcPr>
           <w:p>
             <w:r/>
             <w:r>
               <w:rPr>
-                <w:sz w:val="19"/>
+                <w:sz w:val="17"/>
               </w:rPr>
               <w:t>72</w:t>
             </w:r>
@@ -2970,13 +3032,13 @@
         </w:tc>
         <w:tc>
           <w:tcPr>
-            <w:tcW w:type="dxa" w:w="1872"/>
+            <w:tcW w:type="dxa" w:w="1224"/>
           </w:tcPr>
           <w:p>
             <w:r/>
             <w:r>
               <w:rPr>
-                <w:sz w:val="19"/>
+                <w:sz w:val="17"/>
               </w:rPr>
               <w:t>120</w:t>
             </w:r>
@@ -2984,13 +3046,13 @@
         </w:tc>
         <w:tc>
           <w:tcPr>
-            <w:tcW w:type="dxa" w:w="1584"/>
+            <w:tcW w:type="dxa" w:w="1008"/>
           </w:tcPr>
           <w:p>
             <w:r/>
             <w:r>
               <w:rPr>
-                <w:sz w:val="19"/>
+                <w:sz w:val="17"/>
               </w:rPr>
               <w:t>87</w:t>
             </w:r>
@@ -2998,15 +3060,43 @@
         </w:tc>
         <w:tc>
           <w:tcPr>
-            <w:tcW w:type="dxa" w:w="1440"/>
+            <w:tcW w:type="dxa" w:w="1008"/>
           </w:tcPr>
           <w:p>
             <w:r/>
             <w:r>
               <w:rPr>
-                <w:sz w:val="19"/>
+                <w:sz w:val="17"/>
               </w:rPr>
               <w:t>109</w:t>
+            </w:r>
+          </w:p>
+        </w:tc>
+        <w:tc>
+          <w:tcPr>
+            <w:tcW w:type="dxa" w:w="1296"/>
+          </w:tcPr>
+          <w:p>
+            <w:r/>
+            <w:r>
+              <w:rPr>
+                <w:sz w:val="17"/>
+              </w:rPr>
+              <w:t>—</w:t>
+            </w:r>
+          </w:p>
+        </w:tc>
+        <w:tc>
+          <w:tcPr>
+            <w:tcW w:type="dxa" w:w="1296"/>
+          </w:tcPr>
+          <w:p>
+            <w:r/>
+            <w:r>
+              <w:rPr>
+                <w:sz w:val="17"/>
+              </w:rPr>
+              <w:t>—</w:t>
             </w:r>
           </w:p>
         </w:tc>
@@ -3014,13 +3104,13 @@
       <w:tr>
         <w:tc>
           <w:tcPr>
-            <w:tcW w:type="dxa" w:w="2592"/>
+            <w:tcW w:type="dxa" w:w="2232"/>
           </w:tcPr>
           <w:p>
             <w:r/>
             <w:r>
               <w:rPr>
-                <w:sz w:val="19"/>
+                <w:sz w:val="17"/>
               </w:rPr>
               <w:t>Log-focal spread, median [95% CI]</w:t>
             </w:r>
@@ -3028,13 +3118,13 @@
         </w:tc>
         <w:tc>
           <w:tcPr>
-            <w:tcW w:type="dxa" w:w="1872"/>
+            <w:tcW w:type="dxa" w:w="1296"/>
           </w:tcPr>
           <w:p>
             <w:r/>
             <w:r>
               <w:rPr>
-                <w:sz w:val="19"/>
+                <w:sz w:val="17"/>
               </w:rPr>
               <w:t>0.142 [0.106, 0.221]</w:t>
             </w:r>
@@ -3042,13 +3132,13 @@
         </w:tc>
         <w:tc>
           <w:tcPr>
-            <w:tcW w:type="dxa" w:w="1872"/>
+            <w:tcW w:type="dxa" w:w="1224"/>
           </w:tcPr>
           <w:p>
             <w:r/>
             <w:r>
               <w:rPr>
-                <w:sz w:val="19"/>
+                <w:sz w:val="17"/>
               </w:rPr>
               <w:t>0.152 [0.093, 0.220]</w:t>
             </w:r>
@@ -3056,13 +3146,13 @@
         </w:tc>
         <w:tc>
           <w:tcPr>
-            <w:tcW w:type="dxa" w:w="1584"/>
+            <w:tcW w:type="dxa" w:w="1008"/>
           </w:tcPr>
           <w:p>
             <w:r/>
             <w:r>
               <w:rPr>
-                <w:sz w:val="19"/>
+                <w:sz w:val="17"/>
               </w:rPr>
               <w:t>0.465 [0.324, 0.709]</w:t>
             </w:r>
@@ -3070,15 +3160,43 @@
         </w:tc>
         <w:tc>
           <w:tcPr>
-            <w:tcW w:type="dxa" w:w="1440"/>
+            <w:tcW w:type="dxa" w:w="1008"/>
           </w:tcPr>
           <w:p>
             <w:r/>
             <w:r>
               <w:rPr>
-                <w:sz w:val="19"/>
+                <w:sz w:val="17"/>
               </w:rPr>
               <w:t>0.355 [0.272, 0.529]</w:t>
+            </w:r>
+          </w:p>
+        </w:tc>
+        <w:tc>
+          <w:tcPr>
+            <w:tcW w:type="dxa" w:w="1296"/>
+          </w:tcPr>
+          <w:p>
+            <w:r/>
+            <w:r>
+              <w:rPr>
+                <w:sz w:val="17"/>
+              </w:rPr>
+              <w:t>pending</w:t>
+            </w:r>
+          </w:p>
+        </w:tc>
+        <w:tc>
+          <w:tcPr>
+            <w:tcW w:type="dxa" w:w="1296"/>
+          </w:tcPr>
+          <w:p>
+            <w:r/>
+            <w:r>
+              <w:rPr>
+                <w:sz w:val="17"/>
+              </w:rPr>
+              <w:t>pending</w:t>
             </w:r>
           </w:p>
         </w:tc>
@@ -3086,13 +3204,13 @@
       <w:tr>
         <w:tc>
           <w:tcPr>
-            <w:tcW w:type="dxa" w:w="2592"/>
+            <w:tcW w:type="dxa" w:w="2232"/>
           </w:tcPr>
           <w:p>
             <w:r/>
             <w:r>
               <w:rPr>
-                <w:sz w:val="19"/>
+                <w:sz w:val="17"/>
               </w:rPr>
               <w:t>Images with an impossible pair</w:t>
             </w:r>
@@ -3100,13 +3218,13 @@
         </w:tc>
         <w:tc>
           <w:tcPr>
-            <w:tcW w:type="dxa" w:w="1872"/>
+            <w:tcW w:type="dxa" w:w="1296"/>
           </w:tcPr>
           <w:p>
             <w:r/>
             <w:r>
               <w:rPr>
-                <w:sz w:val="19"/>
+                <w:sz w:val="17"/>
               </w:rPr>
               <w:t>28% [19, 39]</w:t>
             </w:r>
@@ -3114,13 +3232,13 @@
         </w:tc>
         <w:tc>
           <w:tcPr>
-            <w:tcW w:type="dxa" w:w="1872"/>
+            <w:tcW w:type="dxa" w:w="1224"/>
           </w:tcPr>
           <w:p>
             <w:r/>
             <w:r>
               <w:rPr>
-                <w:sz w:val="19"/>
+                <w:sz w:val="17"/>
               </w:rPr>
               <w:t>44% [36, 53]</w:t>
             </w:r>
@@ -3128,13 +3246,13 @@
         </w:tc>
         <w:tc>
           <w:tcPr>
-            <w:tcW w:type="dxa" w:w="1584"/>
+            <w:tcW w:type="dxa" w:w="1008"/>
           </w:tcPr>
           <w:p>
             <w:r/>
             <w:r>
               <w:rPr>
-                <w:sz w:val="19"/>
+                <w:sz w:val="17"/>
               </w:rPr>
               <w:t>68% [57, 77]</w:t>
             </w:r>
@@ -3142,15 +3260,43 @@
         </w:tc>
         <w:tc>
           <w:tcPr>
-            <w:tcW w:type="dxa" w:w="1440"/>
+            <w:tcW w:type="dxa" w:w="1008"/>
           </w:tcPr>
           <w:p>
             <w:r/>
             <w:r>
               <w:rPr>
-                <w:sz w:val="19"/>
+                <w:sz w:val="17"/>
               </w:rPr>
               <w:t>58% [48, 66]</w:t>
+            </w:r>
+          </w:p>
+        </w:tc>
+        <w:tc>
+          <w:tcPr>
+            <w:tcW w:type="dxa" w:w="1296"/>
+          </w:tcPr>
+          <w:p>
+            <w:r/>
+            <w:r>
+              <w:rPr>
+                <w:sz w:val="17"/>
+              </w:rPr>
+              <w:t>pending</w:t>
+            </w:r>
+          </w:p>
+        </w:tc>
+        <w:tc>
+          <w:tcPr>
+            <w:tcW w:type="dxa" w:w="1296"/>
+          </w:tcPr>
+          <w:p>
+            <w:r/>
+            <w:r>
+              <w:rPr>
+                <w:sz w:val="17"/>
+              </w:rPr>
+              <w:t>pending</w:t>
             </w:r>
           </w:p>
         </w:tc>
@@ -3158,13 +3304,13 @@
       <w:tr>
         <w:tc>
           <w:tcPr>
-            <w:tcW w:type="dxa" w:w="2592"/>
+            <w:tcW w:type="dxa" w:w="2232"/>
           </w:tcPr>
           <w:p>
             <w:r/>
             <w:r>
               <w:rPr>
-                <w:sz w:val="19"/>
+                <w:sz w:val="17"/>
               </w:rPr>
               <w:t>Manhattan orthogonality (secondary)</w:t>
             </w:r>
@@ -3172,13 +3318,13 @@
         </w:tc>
         <w:tc>
           <w:tcPr>
-            <w:tcW w:type="dxa" w:w="1872"/>
+            <w:tcW w:type="dxa" w:w="1296"/>
           </w:tcPr>
           <w:p>
             <w:r/>
             <w:r>
               <w:rPr>
-                <w:sz w:val="19"/>
+                <w:sz w:val="17"/>
               </w:rPr>
               <w:t>0.65 deg</w:t>
             </w:r>
@@ -3186,13 +3332,13 @@
         </w:tc>
         <w:tc>
           <w:tcPr>
-            <w:tcW w:type="dxa" w:w="1872"/>
+            <w:tcW w:type="dxa" w:w="1224"/>
           </w:tcPr>
           <w:p>
             <w:r/>
             <w:r>
               <w:rPr>
-                <w:sz w:val="19"/>
+                <w:sz w:val="17"/>
               </w:rPr>
               <w:t>2.82 deg</w:t>
             </w:r>
@@ -3200,13 +3346,13 @@
         </w:tc>
         <w:tc>
           <w:tcPr>
-            <w:tcW w:type="dxa" w:w="1584"/>
+            <w:tcW w:type="dxa" w:w="1008"/>
           </w:tcPr>
           <w:p>
             <w:r/>
             <w:r>
               <w:rPr>
-                <w:sz w:val="19"/>
+                <w:sz w:val="17"/>
               </w:rPr>
               <w:t>2.93 deg</w:t>
             </w:r>
@@ -3214,15 +3360,43 @@
         </w:tc>
         <w:tc>
           <w:tcPr>
-            <w:tcW w:type="dxa" w:w="1440"/>
+            <w:tcW w:type="dxa" w:w="1008"/>
           </w:tcPr>
           <w:p>
             <w:r/>
             <w:r>
               <w:rPr>
-                <w:sz w:val="19"/>
+                <w:sz w:val="17"/>
               </w:rPr>
               <w:t>1.94 deg</w:t>
+            </w:r>
+          </w:p>
+        </w:tc>
+        <w:tc>
+          <w:tcPr>
+            <w:tcW w:type="dxa" w:w="1296"/>
+          </w:tcPr>
+          <w:p>
+            <w:r/>
+            <w:r>
+              <w:rPr>
+                <w:sz w:val="17"/>
+              </w:rPr>
+              <w:t>pending</w:t>
+            </w:r>
+          </w:p>
+        </w:tc>
+        <w:tc>
+          <w:tcPr>
+            <w:tcW w:type="dxa" w:w="1296"/>
+          </w:tcPr>
+          <w:p>
+            <w:r/>
+            <w:r>
+              <w:rPr>
+                <w:sz w:val="17"/>
+              </w:rPr>
+              <w:t>pending</w:t>
             </w:r>
           </w:p>
         </w:tc>
@@ -3243,7 +3417,38 @@
           <w:i/>
           <w:sz w:val="19"/>
         </w:rPr>
-        <w:t>Table 5.2: Atlanta focal consistency on admitted images. Intervals are bootstrap intervals for medians and Wilson intervals for proportions.</w:t>
+        <w:t>Table 5.2: Atlanta focal consistency on admitted images. Intervals are bootstrap intervals for medians and Wilson intervals for proportions. The two right-hand columns are reserved for closed frontier models (Section 5.4.1).</w:t>
+      </w:r>
+    </w:p>
+    <w:p>
+      <w:pPr>
+        <w:pStyle w:val="Heading3"/>
+      </w:pPr>
+      <w:r>
+        <w:t>5.4.1 Reserved: frontier closed models</w:t>
+      </w:r>
+    </w:p>
+    <w:p>
+      <w:pPr>
+        <w:shd w:val="clear" w:fill="F2F2F2"/>
+        <w:spacing w:before="120" w:after="120"/>
+      </w:pPr>
+      <w:r>
+        <w:rPr>
+          <w:i/>
+          <w:color w:val="884400"/>
+          <w:sz w:val="20"/>
+        </w:rPr>
+        <w:t>[FIGURE TO INSERT] Results for Gemini and GPT-image. These columns are reserved, not omitted: the same 200 prompts used for the local models are exported to data/generated/prompts.txt, so the images are content-matched by construction. Procedure: save the generated images as 0000.png, 0001.png ... (keeping the prompt index) into data/generated/gemini/ and data/generated/gptimage/, record the model version and date in a README.txt in each folder, then run  python scripts/atlanta_compare.py --real data/real/commons --gen data/generated/sdxl_rich data/generated/sd15_rich data/generated/gemini data/generated/gptimage  and copy the resulting medians and intervals into Table 5.2. Thirty to fifty images per model is sufficient for the median and its interval.</w:t>
+      </w:r>
+    </w:p>
+    <w:p>
+      <w:r>
+        <w:rPr>
+          <w:b w:val="0"/>
+          <w:i w:val="0"/>
+        </w:rPr>
+        <w:t>This is the single highest-value extension of the study. Stable Diffusion 1.5 and SDXL differ by roughly two years of model development, and the orientation residual improves across that gap while camera coherence does not. Whether a current frontier model has closed the camera-coherence gap is therefore the direct test of the claim, made informally in 2026 commentary, that the geometric tell has disappeared. The measurement pipeline is model-agnostic and requires no modification to accept these images.</w:t>
       </w:r>
     </w:p>
     <w:p>
@@ -3652,7 +3857,7 @@
           <w:i/>
           <w:sz w:val="19"/>
         </w:rPr>
-        <w:t>Table 5.3: Scaling comparison on identical prompts, 87 and 109 usable images respectively.</w:t>
+        <w:t>Table 5.3: Scaling comparison on identical prompts, 87 and 109 usable images respectively. A frontier model added to this comparison would extend the capability axis by a further generation; see Section 5.4.1.</w:t>
       </w:r>
     </w:p>
     <w:p>
@@ -4271,7 +4476,7 @@
           <w:b w:val="0"/>
           <w:i w:val="0"/>
         </w:rPr>
-        <w:t>Frontier closed models are not yet evaluated, so the conclusions apply to locally reproducible open models. The shadow constraint is not deployed at scale. Generated images are analysed after downsampling to the resolution of the curated real reference, and the effect of resampling on line detection has not been isolated, although the comparison against the uncurated corpus is resampling-matched and gives the same conclusion. Several constraint levels remain unimplemented.</w:t>
+        <w:t>Frontier closed models are not yet evaluated, so the conclusions apply to locally reproducible open models; Table 5.2 reserves columns for them and Section 5.4.1 gives the procedure. The shadow constraint is not deployed at scale. Generated images are analysed after downsampling to the resolution of the curated real reference, and the effect of resampling on line detection has not been isolated, although the comparison against the uncurated corpus is resampling-matched and gives the same conclusion. Several constraint levels remain unimplemented.</w:t>
       </w:r>
     </w:p>
     <w:p>

</xml_diff>